<commit_message>
preliminary research is done
</commit_message>
<xml_diff>
--- a/ProgressResearch.docx
+++ b/ProgressResearch.docx
@@ -4,13 +4,8 @@
   <w:body>
     <w:p>
       <w:r>
-        <w:t xml:space="preserve">William </w:t>
+        <w:t>William Chokbengboune</w:t>
       </w:r>
-      <w:proofErr w:type="spellStart"/>
-      <w:r>
-        <w:t>Chokbengboune</w:t>
-      </w:r>
-      <w:proofErr w:type="spellEnd"/>
     </w:p>
     <w:p/>
     <w:p>
@@ -23,18 +18,7 @@
         <w:ind w:firstLine="720"/>
       </w:pPr>
       <w:r>
-        <w:t xml:space="preserve">With hunting becoming not as common </w:t>
-      </w:r>
-      <w:proofErr w:type="gramStart"/>
-      <w:r>
-        <w:t>of</w:t>
-      </w:r>
-      <w:proofErr w:type="gramEnd"/>
-      <w:r>
-        <w:t xml:space="preserve"> an outdoor activity, animal populations have grown. In recent cases, deer and hog populations have grown explosively over the past few years. </w:t>
-      </w:r>
-      <w:r>
-        <w:t>Because of the decrease in hunters, areas such as New York, Michigan, Pennsylvania and Connecticut are having trouble with the destruction caused by the herbivores being rampant and overabundant.</w:t>
+        <w:t>With Georgia becoming so populated, natural and unique habitats are being torn down. In doing so, we are destroying the ecological food chain for that area and endangering the local wildlife in that area. Savannah is an example of a city that is rapidly expanding to handle the population growth while destroying the natural habitat.</w:t>
       </w:r>
     </w:p>
     <w:p/>
@@ -46,25 +30,66 @@
     <w:p>
       <w:r>
         <w:tab/>
-        <w:t xml:space="preserve">Because there is a lack of hunters, there is an increase </w:t>
       </w:r>
-      <w:proofErr w:type="gramStart"/>
       <w:r>
-        <w:t>to</w:t>
-      </w:r>
-      <w:proofErr w:type="gramEnd"/>
-      <w:r>
-        <w:t xml:space="preserve"> damage </w:t>
-      </w:r>
-      <w:proofErr w:type="gramStart"/>
-      <w:r>
-        <w:t>of</w:t>
-      </w:r>
-      <w:proofErr w:type="gramEnd"/>
-      <w:r>
-        <w:t xml:space="preserve"> these lands. As such there will be higher insurance on farms and vehicles.</w:t>
+        <w:t>Because we are building so much around the city of savannah, we are destroying the unique ecology. In doing so, we are endangering the local wildlife.</w:t>
       </w:r>
     </w:p>
+    <w:p/>
+    <w:p>
+      <w:r>
+        <w:t>To get the Georgia parameters for the curl I use this command:</w:t>
+      </w:r>
+    </w:p>
+    <w:p>
+      <w:pPr>
+        <w:pStyle w:val="ListParagraph"/>
+        <w:numPr>
+          <w:ilvl w:val="0"/>
+          <w:numId w:val="2"/>
+        </w:numPr>
+      </w:pPr>
+      <w:r>
+        <w:t xml:space="preserve">curl -L -o habitat_full.csv </w:t>
+      </w:r>
+      <w:hyperlink r:id="rId5" w:history="1">
+        <w:r>
+          <w:rPr>
+            <w:rStyle w:val="Hyperlink"/>
+          </w:rPr>
+          <w:t>https://ecos.fws.gov/ecp/pullreports/catalog/species/report/species/export?format=csv&amp;columns=/species@cn,sn,status_category&amp;filter=/species@status_category='Listed'</w:t>
+        </w:r>
+      </w:hyperlink>
+    </w:p>
+    <w:p>
+      <w:r>
+        <w:t>This is the awk command to get rows containing ‘Georgia’</w:t>
+      </w:r>
+    </w:p>
+    <w:p>
+      <w:pPr>
+        <w:pStyle w:val="ListParagraph"/>
+        <w:numPr>
+          <w:ilvl w:val="0"/>
+          <w:numId w:val="2"/>
+        </w:numPr>
+      </w:pPr>
+      <w:r>
+        <w:t xml:space="preserve"> awk -F, '/Georgia/ {print $0}' habitat_full.csv &gt; georgia_habitats.csv</w:t>
+      </w:r>
+    </w:p>
+    <w:p>
+      <w:r>
+        <w:t>Preliminary Summary</w:t>
+      </w:r>
+    </w:p>
+    <w:p>
+      <w:r>
+        <w:tab/>
+        <w:t>After reading through the links provided, every single animal in the list is endangered. With the accelerated construction, the habitats are no more for 1 of the animals and almost gone for the other 2. The species are continued to be endangered and will be so for an unspecified amount of time.</w:t>
+      </w:r>
+    </w:p>
+    <w:p/>
     <w:sectPr>
       <w:pgSz w:w="12240" w:h="15840"/>
       <w:pgMar w:top="1440" w:right="1440" w:bottom="1440" w:left="1440" w:header="720" w:footer="720" w:gutter="0"/>
@@ -73,6 +98,243 @@
     </w:sectPr>
   </w:body>
 </w:document>
+</file>
+
+<file path=word/numbering.xml><?xml version="1.0" encoding="utf-8"?>
+<w:numbering xmlns:wpc="http://schemas.microsoft.com/office/word/2010/wordprocessingCanvas" xmlns:cx="http://schemas.microsoft.com/office/drawing/2014/chartex" xmlns:cx1="http://schemas.microsoft.com/office/drawing/2015/9/8/chartex" xmlns:cx2="http://schemas.microsoft.com/office/drawing/2015/10/21/chartex" xmlns:cx3="http://schemas.microsoft.com/office/drawing/2016/5/9/chartex" xmlns:cx4="http://schemas.microsoft.com/office/drawing/2016/5/10/chartex" xmlns:cx5="http://schemas.microsoft.com/office/drawing/2016/5/11/chartex" xmlns:cx6="http://schemas.microsoft.com/office/drawing/2016/5/12/chartex" xmlns:cx7="http://schemas.microsoft.com/office/drawing/2016/5/13/chartex" xmlns:cx8="http://schemas.microsoft.com/office/drawing/2016/5/14/chartex" xmlns:mc="http://schemas.openxmlformats.org/markup-compatibility/2006" xmlns:aink="http://schemas.microsoft.com/office/drawing/2016/ink" xmlns:am3d="http://schemas.microsoft.com/office/drawing/2017/model3d" xmlns:o="urn:schemas-microsoft-com:office:office" xmlns:oel="http://schemas.microsoft.com/office/2019/extlst" xmlns:r="http://schemas.openxmlformats.org/officeDocument/2006/relationships" xmlns:m="http://schemas.openxmlformats.org/officeDocument/2006/math" xmlns:v="urn:schemas-microsoft-com:vml" xmlns:wp14="http://schemas.microsoft.com/office/word/2010/wordprocessingDrawing" xmlns:wp="http://schemas.openxmlformats.org/drawingml/2006/wordprocessingDrawing" xmlns:w10="urn:schemas-microsoft-com:office:word" xmlns:w="http://schemas.openxmlformats.org/wordprocessingml/2006/main" xmlns:w14="http://schemas.microsoft.com/office/word/2010/wordml" xmlns:w15="http://schemas.microsoft.com/office/word/2012/wordml" xmlns:w16cex="http://schemas.microsoft.com/office/word/2018/wordml/cex" xmlns:w16cid="http://schemas.microsoft.com/office/word/2016/wordml/cid" xmlns:w16="http://schemas.microsoft.com/office/word/2018/wordml" xmlns:w16du="http://schemas.microsoft.com/office/word/2023/wordml/word16du" xmlns:w16sdtdh="http://schemas.microsoft.com/office/word/2020/wordml/sdtdatahash" xmlns:w16sdtfl="http://schemas.microsoft.com/office/word/2024/wordml/sdtformatlock" xmlns:w16se="http://schemas.microsoft.com/office/word/2015/wordml/symex" xmlns:wpg="http://schemas.microsoft.com/office/word/2010/wordprocessingGroup" xmlns:wpi="http://schemas.microsoft.com/office/word/2010/wordprocessingInk" xmlns:wne="http://schemas.microsoft.com/office/word/2006/wordml" xmlns:wps="http://schemas.microsoft.com/office/word/2010/wordprocessingShape" mc:Ignorable="w14 w15 w16se w16cid w16 w16cex w16sdtdh w16sdtfl w16du wp14">
+  <w:abstractNum w:abstractNumId="0" w15:restartNumberingAfterBreak="0">
+    <w:nsid w:val="38223025"/>
+    <w:multiLevelType w:val="hybridMultilevel"/>
+    <w:tmpl w:val="636EF9B0"/>
+    <w:lvl w:ilvl="0" w:tplc="04090001">
+      <w:start w:val="1"/>
+      <w:numFmt w:val="bullet"/>
+      <w:lvlText w:val=""/>
+      <w:lvlJc w:val="left"/>
+      <w:pPr>
+        <w:ind w:left="720" w:hanging="360"/>
+      </w:pPr>
+      <w:rPr>
+        <w:rFonts w:ascii="Symbol" w:hAnsi="Symbol" w:hint="default"/>
+      </w:rPr>
+    </w:lvl>
+    <w:lvl w:ilvl="1" w:tplc="04090003" w:tentative="1">
+      <w:start w:val="1"/>
+      <w:numFmt w:val="bullet"/>
+      <w:lvlText w:val="o"/>
+      <w:lvlJc w:val="left"/>
+      <w:pPr>
+        <w:ind w:left="1440" w:hanging="360"/>
+      </w:pPr>
+      <w:rPr>
+        <w:rFonts w:ascii="Courier New" w:hAnsi="Courier New" w:cs="Courier New" w:hint="default"/>
+      </w:rPr>
+    </w:lvl>
+    <w:lvl w:ilvl="2" w:tplc="04090005" w:tentative="1">
+      <w:start w:val="1"/>
+      <w:numFmt w:val="bullet"/>
+      <w:lvlText w:val=""/>
+      <w:lvlJc w:val="left"/>
+      <w:pPr>
+        <w:ind w:left="2160" w:hanging="360"/>
+      </w:pPr>
+      <w:rPr>
+        <w:rFonts w:ascii="Wingdings" w:hAnsi="Wingdings" w:hint="default"/>
+      </w:rPr>
+    </w:lvl>
+    <w:lvl w:ilvl="3" w:tplc="04090001" w:tentative="1">
+      <w:start w:val="1"/>
+      <w:numFmt w:val="bullet"/>
+      <w:lvlText w:val=""/>
+      <w:lvlJc w:val="left"/>
+      <w:pPr>
+        <w:ind w:left="2880" w:hanging="360"/>
+      </w:pPr>
+      <w:rPr>
+        <w:rFonts w:ascii="Symbol" w:hAnsi="Symbol" w:hint="default"/>
+      </w:rPr>
+    </w:lvl>
+    <w:lvl w:ilvl="4" w:tplc="04090003" w:tentative="1">
+      <w:start w:val="1"/>
+      <w:numFmt w:val="bullet"/>
+      <w:lvlText w:val="o"/>
+      <w:lvlJc w:val="left"/>
+      <w:pPr>
+        <w:ind w:left="3600" w:hanging="360"/>
+      </w:pPr>
+      <w:rPr>
+        <w:rFonts w:ascii="Courier New" w:hAnsi="Courier New" w:cs="Courier New" w:hint="default"/>
+      </w:rPr>
+    </w:lvl>
+    <w:lvl w:ilvl="5" w:tplc="04090005" w:tentative="1">
+      <w:start w:val="1"/>
+      <w:numFmt w:val="bullet"/>
+      <w:lvlText w:val=""/>
+      <w:lvlJc w:val="left"/>
+      <w:pPr>
+        <w:ind w:left="4320" w:hanging="360"/>
+      </w:pPr>
+      <w:rPr>
+        <w:rFonts w:ascii="Wingdings" w:hAnsi="Wingdings" w:hint="default"/>
+      </w:rPr>
+    </w:lvl>
+    <w:lvl w:ilvl="6" w:tplc="04090001" w:tentative="1">
+      <w:start w:val="1"/>
+      <w:numFmt w:val="bullet"/>
+      <w:lvlText w:val=""/>
+      <w:lvlJc w:val="left"/>
+      <w:pPr>
+        <w:ind w:left="5040" w:hanging="360"/>
+      </w:pPr>
+      <w:rPr>
+        <w:rFonts w:ascii="Symbol" w:hAnsi="Symbol" w:hint="default"/>
+      </w:rPr>
+    </w:lvl>
+    <w:lvl w:ilvl="7" w:tplc="04090003" w:tentative="1">
+      <w:start w:val="1"/>
+      <w:numFmt w:val="bullet"/>
+      <w:lvlText w:val="o"/>
+      <w:lvlJc w:val="left"/>
+      <w:pPr>
+        <w:ind w:left="5760" w:hanging="360"/>
+      </w:pPr>
+      <w:rPr>
+        <w:rFonts w:ascii="Courier New" w:hAnsi="Courier New" w:cs="Courier New" w:hint="default"/>
+      </w:rPr>
+    </w:lvl>
+    <w:lvl w:ilvl="8" w:tplc="04090005" w:tentative="1">
+      <w:start w:val="1"/>
+      <w:numFmt w:val="bullet"/>
+      <w:lvlText w:val=""/>
+      <w:lvlJc w:val="left"/>
+      <w:pPr>
+        <w:ind w:left="6480" w:hanging="360"/>
+      </w:pPr>
+      <w:rPr>
+        <w:rFonts w:ascii="Wingdings" w:hAnsi="Wingdings" w:hint="default"/>
+      </w:rPr>
+    </w:lvl>
+  </w:abstractNum>
+  <w:abstractNum w:abstractNumId="1" w15:restartNumberingAfterBreak="0">
+    <w:nsid w:val="48122FA0"/>
+    <w:multiLevelType w:val="hybridMultilevel"/>
+    <w:tmpl w:val="679AD84C"/>
+    <w:lvl w:ilvl="0" w:tplc="04090001">
+      <w:start w:val="1"/>
+      <w:numFmt w:val="bullet"/>
+      <w:lvlText w:val=""/>
+      <w:lvlJc w:val="left"/>
+      <w:pPr>
+        <w:ind w:left="720" w:hanging="360"/>
+      </w:pPr>
+      <w:rPr>
+        <w:rFonts w:ascii="Symbol" w:hAnsi="Symbol" w:hint="default"/>
+      </w:rPr>
+    </w:lvl>
+    <w:lvl w:ilvl="1" w:tplc="04090003" w:tentative="1">
+      <w:start w:val="1"/>
+      <w:numFmt w:val="bullet"/>
+      <w:lvlText w:val="o"/>
+      <w:lvlJc w:val="left"/>
+      <w:pPr>
+        <w:ind w:left="1440" w:hanging="360"/>
+      </w:pPr>
+      <w:rPr>
+        <w:rFonts w:ascii="Courier New" w:hAnsi="Courier New" w:cs="Courier New" w:hint="default"/>
+      </w:rPr>
+    </w:lvl>
+    <w:lvl w:ilvl="2" w:tplc="04090005" w:tentative="1">
+      <w:start w:val="1"/>
+      <w:numFmt w:val="bullet"/>
+      <w:lvlText w:val=""/>
+      <w:lvlJc w:val="left"/>
+      <w:pPr>
+        <w:ind w:left="2160" w:hanging="360"/>
+      </w:pPr>
+      <w:rPr>
+        <w:rFonts w:ascii="Wingdings" w:hAnsi="Wingdings" w:hint="default"/>
+      </w:rPr>
+    </w:lvl>
+    <w:lvl w:ilvl="3" w:tplc="04090001" w:tentative="1">
+      <w:start w:val="1"/>
+      <w:numFmt w:val="bullet"/>
+      <w:lvlText w:val=""/>
+      <w:lvlJc w:val="left"/>
+      <w:pPr>
+        <w:ind w:left="2880" w:hanging="360"/>
+      </w:pPr>
+      <w:rPr>
+        <w:rFonts w:ascii="Symbol" w:hAnsi="Symbol" w:hint="default"/>
+      </w:rPr>
+    </w:lvl>
+    <w:lvl w:ilvl="4" w:tplc="04090003" w:tentative="1">
+      <w:start w:val="1"/>
+      <w:numFmt w:val="bullet"/>
+      <w:lvlText w:val="o"/>
+      <w:lvlJc w:val="left"/>
+      <w:pPr>
+        <w:ind w:left="3600" w:hanging="360"/>
+      </w:pPr>
+      <w:rPr>
+        <w:rFonts w:ascii="Courier New" w:hAnsi="Courier New" w:cs="Courier New" w:hint="default"/>
+      </w:rPr>
+    </w:lvl>
+    <w:lvl w:ilvl="5" w:tplc="04090005" w:tentative="1">
+      <w:start w:val="1"/>
+      <w:numFmt w:val="bullet"/>
+      <w:lvlText w:val=""/>
+      <w:lvlJc w:val="left"/>
+      <w:pPr>
+        <w:ind w:left="4320" w:hanging="360"/>
+      </w:pPr>
+      <w:rPr>
+        <w:rFonts w:ascii="Wingdings" w:hAnsi="Wingdings" w:hint="default"/>
+      </w:rPr>
+    </w:lvl>
+    <w:lvl w:ilvl="6" w:tplc="04090001" w:tentative="1">
+      <w:start w:val="1"/>
+      <w:numFmt w:val="bullet"/>
+      <w:lvlText w:val=""/>
+      <w:lvlJc w:val="left"/>
+      <w:pPr>
+        <w:ind w:left="5040" w:hanging="360"/>
+      </w:pPr>
+      <w:rPr>
+        <w:rFonts w:ascii="Symbol" w:hAnsi="Symbol" w:hint="default"/>
+      </w:rPr>
+    </w:lvl>
+    <w:lvl w:ilvl="7" w:tplc="04090003" w:tentative="1">
+      <w:start w:val="1"/>
+      <w:numFmt w:val="bullet"/>
+      <w:lvlText w:val="o"/>
+      <w:lvlJc w:val="left"/>
+      <w:pPr>
+        <w:ind w:left="5760" w:hanging="360"/>
+      </w:pPr>
+      <w:rPr>
+        <w:rFonts w:ascii="Courier New" w:hAnsi="Courier New" w:cs="Courier New" w:hint="default"/>
+      </w:rPr>
+    </w:lvl>
+    <w:lvl w:ilvl="8" w:tplc="04090005" w:tentative="1">
+      <w:start w:val="1"/>
+      <w:numFmt w:val="bullet"/>
+      <w:lvlText w:val=""/>
+      <w:lvlJc w:val="left"/>
+      <w:pPr>
+        <w:ind w:left="6480" w:hanging="360"/>
+      </w:pPr>
+      <w:rPr>
+        <w:rFonts w:ascii="Wingdings" w:hAnsi="Wingdings" w:hint="default"/>
+      </w:rPr>
+    </w:lvl>
+  </w:abstractNum>
+  <w:num w:numId="1" w16cid:durableId="853498436">
+    <w:abstractNumId w:val="0"/>
+  </w:num>
+  <w:num w:numId="2" w16cid:durableId="1051731701">
+    <w:abstractNumId w:val="1"/>
+  </w:num>
+</w:numbering>
 </file>
 
 <file path=word/styles.xml><?xml version="1.0" encoding="utf-8"?>
@@ -678,7 +940,6 @@
   <w:style w:type="character" w:default="1" w:styleId="DefaultParagraphFont">
     <w:name w:val="Default Paragraph Font"/>
     <w:uiPriority w:val="1"/>
-    <w:semiHidden/>
     <w:unhideWhenUsed/>
   </w:style>
   <w:style w:type="table" w:default="1" w:styleId="TableNormal">
@@ -990,6 +1251,29 @@
       <w:smallCaps/>
       <w:color w:val="0F4761" w:themeColor="accent1" w:themeShade="BF"/>
       <w:spacing w:val="5"/>
+    </w:rPr>
+  </w:style>
+  <w:style w:type="character" w:styleId="Hyperlink">
+    <w:name w:val="Hyperlink"/>
+    <w:basedOn w:val="DefaultParagraphFont"/>
+    <w:uiPriority w:val="99"/>
+    <w:unhideWhenUsed/>
+    <w:rsid w:val="000902AD"/>
+    <w:rPr>
+      <w:color w:val="467886" w:themeColor="hyperlink"/>
+      <w:u w:val="single"/>
+    </w:rPr>
+  </w:style>
+  <w:style w:type="character" w:styleId="UnresolvedMention">
+    <w:name w:val="Unresolved Mention"/>
+    <w:basedOn w:val="DefaultParagraphFont"/>
+    <w:uiPriority w:val="99"/>
+    <w:semiHidden/>
+    <w:unhideWhenUsed/>
+    <w:rsid w:val="000902AD"/>
+    <w:rPr>
+      <w:color w:val="605E5C"/>
+      <w:shd w:val="clear" w:color="auto" w:fill="E1DFDD"/>
     </w:rPr>
   </w:style>
 </w:styles>

</xml_diff>

<commit_message>
added information to progress report
</commit_message>
<xml_diff>
--- a/ProgressResearch.docx
+++ b/ProgressResearch.docx
@@ -18,7 +18,15 @@
         <w:ind w:firstLine="720"/>
       </w:pPr>
       <w:r>
-        <w:t>With Georgia becoming so populated, natural and unique habitats are being torn down. In doing so, we are destroying the ecological food chain for that area and endangering the local wildlife in that area. Savannah is an example of a city that is rapidly expanding to handle the population growth while destroying the natural habitat.</w:t>
+        <w:t xml:space="preserve">With Georgia becoming so populated, natural and unique habitats are being torn down. In doing so, we are destroying the ecological food chain for that area and endangering the local wildlife in that area. Savannah is an example of a city that is rapidly expanding to handle </w:t>
+      </w:r>
+      <w:proofErr w:type="gramStart"/>
+      <w:r>
+        <w:t>the population</w:t>
+      </w:r>
+      <w:proofErr w:type="gramEnd"/>
+      <w:r>
+        <w:t xml:space="preserve"> growth while destroying the natural habitat.</w:t>
       </w:r>
     </w:p>
     <w:p/>
@@ -86,10 +94,431 @@
     <w:p>
       <w:r>
         <w:tab/>
-        <w:t>After reading through the links provided, every single animal in the list is endangered. With the accelerated construction, the habitats are no more for 1 of the animals and almost gone for the other 2. The species are continued to be endangered and will be so for an unspecified amount of time.</w:t>
+        <w:t xml:space="preserve">After reading through the links provided, every single animal in the list is endangered. With the accelerated construction, the habitats are no </w:t>
+      </w:r>
+      <w:proofErr w:type="gramStart"/>
+      <w:r>
+        <w:t>more</w:t>
+      </w:r>
+      <w:proofErr w:type="gramEnd"/>
+      <w:r>
+        <w:t xml:space="preserve"> for 1 of the animals and almost gone for the other 2. The species </w:t>
+      </w:r>
+      <w:proofErr w:type="gramStart"/>
+      <w:r>
+        <w:t>are continued</w:t>
+      </w:r>
+      <w:proofErr w:type="gramEnd"/>
+      <w:r>
+        <w:t xml:space="preserve"> to be endangered and will be so for an unspecified amount of time.</w:t>
       </w:r>
     </w:p>
     <w:p/>
+    <w:p>
+      <w:r>
+        <w:t>Updating information</w:t>
+      </w:r>
+    </w:p>
+    <w:p/>
+    <w:p>
+      <w:r>
+        <w:t>INPUT_FILE="georgia_habitats.csv"</w:t>
+      </w:r>
+    </w:p>
+    <w:p>
+      <w:r>
+        <w:t>OUTPUT_FILE="georgia_habitats_updated.csv"</w:t>
+      </w:r>
+    </w:p>
+    <w:p>
+      <w:r>
+        <w:lastRenderedPageBreak/>
+        <w:t>USER_AGENT="Mozilla/5.0"</w:t>
+      </w:r>
+    </w:p>
+    <w:p>
+      <w:r>
+        <w:t xml:space="preserve">echo "Common </w:t>
+      </w:r>
+      <w:proofErr w:type="spellStart"/>
+      <w:r>
+        <w:t>Name,Scientific</w:t>
+      </w:r>
+      <w:proofErr w:type="spellEnd"/>
+      <w:r>
+        <w:t xml:space="preserve"> </w:t>
+      </w:r>
+      <w:proofErr w:type="spellStart"/>
+      <w:r>
+        <w:t>Name,URL,Status,Date</w:t>
+      </w:r>
+      <w:proofErr w:type="spellEnd"/>
+      <w:r>
+        <w:t xml:space="preserve"> </w:t>
+      </w:r>
+      <w:proofErr w:type="spellStart"/>
+      <w:r>
+        <w:t>Listed,Lead</w:t>
+      </w:r>
+      <w:proofErr w:type="spellEnd"/>
+      <w:r>
+        <w:t xml:space="preserve"> </w:t>
+      </w:r>
+      <w:proofErr w:type="spellStart"/>
+      <w:r>
+        <w:t>Region,Where</w:t>
+      </w:r>
+      <w:proofErr w:type="spellEnd"/>
+      <w:r>
+        <w:t xml:space="preserve"> Listed" &gt; "$OUTPUT_FILE"</w:t>
+      </w:r>
+    </w:p>
+    <w:p/>
+    <w:p>
+      <w:r>
+        <w:t xml:space="preserve">while IFS=',' read -r </w:t>
+      </w:r>
+      <w:proofErr w:type="spellStart"/>
+      <w:r>
+        <w:t>common_name</w:t>
+      </w:r>
+      <w:proofErr w:type="spellEnd"/>
+      <w:r>
+        <w:t xml:space="preserve"> </w:t>
+      </w:r>
+      <w:proofErr w:type="spellStart"/>
+      <w:r>
+        <w:t>scientific_name</w:t>
+      </w:r>
+      <w:proofErr w:type="spellEnd"/>
+      <w:r>
+        <w:t xml:space="preserve"> </w:t>
+      </w:r>
+      <w:proofErr w:type="spellStart"/>
+      <w:r>
+        <w:t>url</w:t>
+      </w:r>
+      <w:proofErr w:type="spellEnd"/>
+      <w:r>
+        <w:t xml:space="preserve"> </w:t>
+      </w:r>
+      <w:proofErr w:type="spellStart"/>
+      <w:r>
+        <w:t>old_status</w:t>
+      </w:r>
+      <w:proofErr w:type="spellEnd"/>
+      <w:r>
+        <w:t>; do</w:t>
+      </w:r>
+    </w:p>
+    <w:p>
+      <w:r>
+        <w:t xml:space="preserve">    # Skip the header row of the input file</w:t>
+      </w:r>
+    </w:p>
+    <w:p>
+      <w:r>
+        <w:t xml:space="preserve">    if [[ "$</w:t>
+      </w:r>
+      <w:proofErr w:type="spellStart"/>
+      <w:r>
+        <w:t>common_name</w:t>
+      </w:r>
+      <w:proofErr w:type="spellEnd"/>
+      <w:r>
+        <w:t>" == "Common Name" || -z "$</w:t>
+      </w:r>
+      <w:proofErr w:type="spellStart"/>
+      <w:r>
+        <w:t>scientific_</w:t>
+      </w:r>
+      <w:proofErr w:type="gramStart"/>
+      <w:r>
+        <w:t>name</w:t>
+      </w:r>
+      <w:proofErr w:type="spellEnd"/>
+      <w:r>
+        <w:t>" ]</w:t>
+      </w:r>
+      <w:proofErr w:type="gramEnd"/>
+      <w:r>
+        <w:t>]; then continue; fi</w:t>
+      </w:r>
+    </w:p>
+    <w:p/>
+    <w:p>
+      <w:r>
+        <w:t xml:space="preserve">    echo "--------------------------------------------------"</w:t>
+      </w:r>
+    </w:p>
+    <w:p>
+      <w:r>
+        <w:t xml:space="preserve">    echo "Updating: $</w:t>
+      </w:r>
+      <w:proofErr w:type="spellStart"/>
+      <w:r>
+        <w:t>scientific_name</w:t>
+      </w:r>
+      <w:proofErr w:type="spellEnd"/>
+      <w:r>
+        <w:t>"</w:t>
+      </w:r>
+    </w:p>
+    <w:p/>
+    <w:p>
+      <w:r>
+        <w:t xml:space="preserve">    </w:t>
+      </w:r>
+      <w:proofErr w:type="spellStart"/>
+      <w:r>
+        <w:t>clean_sn</w:t>
+      </w:r>
+      <w:proofErr w:type="spellEnd"/>
+      <w:r>
+        <w:t>=$(echo "$</w:t>
+      </w:r>
+      <w:proofErr w:type="spellStart"/>
+      <w:r>
+        <w:t>scientific_name</w:t>
+      </w:r>
+      <w:proofErr w:type="spellEnd"/>
+      <w:r>
+        <w:t xml:space="preserve">" | </w:t>
+      </w:r>
+      <w:proofErr w:type="spellStart"/>
+      <w:r>
+        <w:t>xargs</w:t>
+      </w:r>
+      <w:proofErr w:type="spellEnd"/>
+      <w:r>
+        <w:t>)</w:t>
+      </w:r>
+    </w:p>
+    <w:p>
+      <w:r>
+        <w:t xml:space="preserve">    </w:t>
+      </w:r>
+      <w:proofErr w:type="spellStart"/>
+      <w:r>
+        <w:t>encoded_name</w:t>
+      </w:r>
+      <w:proofErr w:type="spellEnd"/>
+      <w:r>
+        <w:t>=$(echo "$</w:t>
+      </w:r>
+      <w:proofErr w:type="spellStart"/>
+      <w:r>
+        <w:t>clean_sn</w:t>
+      </w:r>
+      <w:proofErr w:type="spellEnd"/>
+      <w:r>
+        <w:t>" | sed 's/ /%20/g')</w:t>
+      </w:r>
+    </w:p>
+    <w:p/>
+    <w:p>
+      <w:r>
+        <w:t xml:space="preserve">    api_url="https://ecos.fws.gov/ecp/pullreports/catalog/species/report/species/export?format=json&amp;columns=/species@cn,sn,status,listing_date&amp;filter=/species@sn='$encoded_name'"</w:t>
+      </w:r>
+    </w:p>
+    <w:p>
+      <w:r>
+        <w:t xml:space="preserve">    </w:t>
+      </w:r>
+    </w:p>
+    <w:p>
+      <w:r>
+        <w:t xml:space="preserve">    response=$(</w:t>
+      </w:r>
+      <w:proofErr w:type="gramStart"/>
+      <w:r>
+        <w:t>curl -s -L</w:t>
+      </w:r>
+      <w:proofErr w:type="gramEnd"/>
+      <w:r>
+        <w:t xml:space="preserve"> -A "$USER_AGENT" "$</w:t>
+      </w:r>
+      <w:proofErr w:type="spellStart"/>
+      <w:r>
+        <w:t>api_url</w:t>
+      </w:r>
+      <w:proofErr w:type="spellEnd"/>
+      <w:r>
+        <w:t>")</w:t>
+      </w:r>
+    </w:p>
+    <w:p/>
+    <w:p>
+      <w:r>
+        <w:t xml:space="preserve"> </w:t>
+      </w:r>
+    </w:p>
+    <w:p>
+      <w:r>
+        <w:t xml:space="preserve">    </w:t>
+      </w:r>
+      <w:proofErr w:type="spellStart"/>
+      <w:r>
+        <w:t>clean_list</w:t>
+      </w:r>
+      <w:proofErr w:type="spellEnd"/>
+      <w:r>
+        <w:t>=$(echo "$response" | sed 's/.*"data":\[\[</w:t>
+      </w:r>
+      <w:proofErr w:type="gramStart"/>
+      <w:r>
+        <w:t>//; s/\]\].*//' |</w:t>
+      </w:r>
+      <w:proofErr w:type="gramEnd"/>
+      <w:r>
+        <w:t xml:space="preserve"> sed 's/"," /|/g; s/","/|/g; s/</w:t>
+      </w:r>
+      <w:proofErr w:type="gramStart"/>
+      <w:r>
+        <w:t>,"/|</w:t>
+      </w:r>
+      <w:proofErr w:type="gramEnd"/>
+      <w:r>
+        <w:t>/g; s/",/|/</w:t>
+      </w:r>
+      <w:proofErr w:type="gramStart"/>
+      <w:r>
+        <w:t>g')</w:t>
+      </w:r>
+      <w:proofErr w:type="gramEnd"/>
+    </w:p>
+    <w:p>
+      <w:r>
+        <w:t xml:space="preserve">    </w:t>
+      </w:r>
+      <w:proofErr w:type="spellStart"/>
+      <w:r>
+        <w:t>ext_status</w:t>
+      </w:r>
+      <w:proofErr w:type="spellEnd"/>
+      <w:r>
+        <w:t>=$(echo "$</w:t>
+      </w:r>
+      <w:proofErr w:type="spellStart"/>
+      <w:r>
+        <w:t>clean_list</w:t>
+      </w:r>
+      <w:proofErr w:type="spellEnd"/>
+      <w:r>
+        <w:t xml:space="preserve">" | cut -d'|' -f4 | tr -d </w:t>
+      </w:r>
+      <w:proofErr w:type="gramStart"/>
+      <w:r>
+        <w:t>'"{}</w:t>
+      </w:r>
+      <w:proofErr w:type="gramEnd"/>
+      <w:r>
+        <w:t xml:space="preserve">' | sed 's/value://g' | </w:t>
+      </w:r>
+      <w:proofErr w:type="spellStart"/>
+      <w:r>
+        <w:t>xargs</w:t>
+      </w:r>
+      <w:proofErr w:type="spellEnd"/>
+      <w:r>
+        <w:t>)</w:t>
+      </w:r>
+    </w:p>
+    <w:p>
+      <w:r>
+        <w:t xml:space="preserve">    </w:t>
+      </w:r>
+      <w:proofErr w:type="spellStart"/>
+      <w:r>
+        <w:t>ext_date</w:t>
+      </w:r>
+      <w:proofErr w:type="spellEnd"/>
+      <w:r>
+        <w:t>=$(echo "$</w:t>
+      </w:r>
+      <w:proofErr w:type="spellStart"/>
+      <w:r>
+        <w:t>clean_list</w:t>
+      </w:r>
+      <w:proofErr w:type="spellEnd"/>
+      <w:r>
+        <w:t xml:space="preserve">" | cut -d'|' -f5 | tr -d </w:t>
+      </w:r>
+      <w:proofErr w:type="gramStart"/>
+      <w:r>
+        <w:t>'"{}</w:t>
+      </w:r>
+      <w:proofErr w:type="gramEnd"/>
+      <w:r>
+        <w:t xml:space="preserve">' | sed 's/value://g' | </w:t>
+      </w:r>
+      <w:proofErr w:type="spellStart"/>
+      <w:r>
+        <w:t>xargs</w:t>
+      </w:r>
+      <w:proofErr w:type="spellEnd"/>
+      <w:r>
+        <w:t>)</w:t>
+      </w:r>
+    </w:p>
+    <w:p>
+      <w:r>
+        <w:t xml:space="preserve">    echo "$common_name,$scientific_name,$url,${ext_status:-N/</w:t>
+      </w:r>
+      <w:proofErr w:type="gramStart"/>
+      <w:r>
+        <w:t>A},</w:t>
+      </w:r>
+      <w:proofErr w:type="gramEnd"/>
+      <w:r>
+        <w:t>${ext_date:-N/</w:t>
+      </w:r>
+      <w:proofErr w:type="gramStart"/>
+      <w:r>
+        <w:t>A},</w:t>
+      </w:r>
+      <w:proofErr w:type="gramEnd"/>
+      <w:r>
+        <w:t>N</w:t>
+      </w:r>
+      <w:proofErr w:type="gramStart"/>
+      <w:r>
+        <w:t>/A,</w:t>
+      </w:r>
+      <w:proofErr w:type="gramEnd"/>
+      <w:r>
+        <w:t>N/A" &gt;&gt; "$OUTPUT_FILE"</w:t>
+      </w:r>
+    </w:p>
+    <w:p/>
+    <w:p>
+      <w:r>
+        <w:t xml:space="preserve">    echo "Successfully updated $</w:t>
+      </w:r>
+      <w:proofErr w:type="spellStart"/>
+      <w:r>
+        <w:t>scientific_name</w:t>
+      </w:r>
+      <w:proofErr w:type="spellEnd"/>
+      <w:r>
+        <w:t>"</w:t>
+      </w:r>
+    </w:p>
+    <w:p>
+      <w:r>
+        <w:t xml:space="preserve">    sleep 1</w:t>
+      </w:r>
+    </w:p>
+    <w:p>
+      <w:r>
+        <w:t>done &lt; "$INPUT_FILE"</w:t>
+      </w:r>
+    </w:p>
+    <w:p>
+      <w:r>
+        <w:t>mv "$OUTPUT_FILE" "$INPUT_FILE"</w:t>
+      </w:r>
+    </w:p>
     <w:sectPr>
       <w:pgSz w:w="12240" w:h="15840"/>
       <w:pgMar w:top="1440" w:right="1440" w:bottom="1440" w:left="1440" w:header="720" w:footer="720" w:gutter="0"/>
@@ -940,6 +1369,7 @@
   <w:style w:type="character" w:default="1" w:styleId="DefaultParagraphFont">
     <w:name w:val="Default Paragraph Font"/>
     <w:uiPriority w:val="1"/>
+    <w:semiHidden/>
     <w:unhideWhenUsed/>
   </w:style>
   <w:style w:type="table" w:default="1" w:styleId="TableNormal">

</xml_diff>

<commit_message>
changing data set to original
</commit_message>
<xml_diff>
--- a/ProgressResearch.docx
+++ b/ProgressResearch.docx
@@ -18,15 +18,7 @@
         <w:ind w:firstLine="720"/>
       </w:pPr>
       <w:r>
-        <w:t xml:space="preserve">With Georgia becoming so populated, natural and unique habitats are being torn down. In doing so, we are destroying the ecological food chain for that area and endangering the local wildlife in that area. Savannah is an example of a city that is rapidly expanding to handle </w:t>
-      </w:r>
-      <w:proofErr w:type="gramStart"/>
-      <w:r>
-        <w:t>the population</w:t>
-      </w:r>
-      <w:proofErr w:type="gramEnd"/>
-      <w:r>
-        <w:t xml:space="preserve"> growth while destroying the natural habitat.</w:t>
+        <w:t>With Georgia becoming so populated, natural and unique habitats are being torn down. In doing so, we are destroying the ecological food chain for that area and endangering the local wildlife in that area. Savannah is an example of a city that is rapidly expanding to handle the population growth while destroying the natural habitat.</w:t>
       </w:r>
     </w:p>
     <w:p/>
@@ -94,23 +86,7 @@
     <w:p>
       <w:r>
         <w:tab/>
-        <w:t xml:space="preserve">After reading through the links provided, every single animal in the list is endangered. With the accelerated construction, the habitats are no </w:t>
-      </w:r>
-      <w:proofErr w:type="gramStart"/>
-      <w:r>
-        <w:t>more</w:t>
-      </w:r>
-      <w:proofErr w:type="gramEnd"/>
-      <w:r>
-        <w:t xml:space="preserve"> for 1 of the animals and almost gone for the other 2. The species </w:t>
-      </w:r>
-      <w:proofErr w:type="gramStart"/>
-      <w:r>
-        <w:t>are continued</w:t>
-      </w:r>
-      <w:proofErr w:type="gramEnd"/>
-      <w:r>
-        <w:t xml:space="preserve"> to be endangered and will be so for an unspecified amount of time.</w:t>
+        <w:t>After reading through the links provided, every single animal in the list is endangered. With the accelerated construction, the habitats are no more for 1 of the animals and almost gone for the other 2. The species are continued to be endangered and will be so for an unspecified amount of time.</w:t>
       </w:r>
     </w:p>
     <w:p/>
@@ -138,385 +114,213 @@
     </w:p>
     <w:p>
       <w:r>
-        <w:t xml:space="preserve">echo "Common </w:t>
-      </w:r>
-      <w:proofErr w:type="spellStart"/>
-      <w:r>
-        <w:t>Name,Scientific</w:t>
-      </w:r>
-      <w:proofErr w:type="spellEnd"/>
+        <w:t>echo "Common Name,Scientific Name,URL,Status,Date Listed,Lead Region,Where Listed" &gt; "$OUTPUT_FILE"</w:t>
+      </w:r>
+    </w:p>
+    <w:p/>
+    <w:p>
+      <w:r>
+        <w:t>while IFS=',' read -r common_name scientific_name url old_status; do</w:t>
+      </w:r>
+    </w:p>
+    <w:p>
+      <w:r>
+        <w:t xml:space="preserve">    # Skip the header row of the input file</w:t>
+      </w:r>
+    </w:p>
+    <w:p>
+      <w:r>
+        <w:t xml:space="preserve">    if [[ "$common_name" == "Common Name" || -z "$scientific_name" ]]; then continue; fi</w:t>
+      </w:r>
+    </w:p>
+    <w:p/>
+    <w:p>
+      <w:r>
+        <w:t xml:space="preserve">    echo "--------------------------------------------------"</w:t>
+      </w:r>
+    </w:p>
+    <w:p>
+      <w:r>
+        <w:t xml:space="preserve">    echo "Updating: $scientific_name"</w:t>
+      </w:r>
+    </w:p>
+    <w:p/>
+    <w:p>
+      <w:r>
+        <w:t xml:space="preserve">    clean_sn=$(echo "$scientific_name" | xargs)</w:t>
+      </w:r>
+    </w:p>
+    <w:p>
+      <w:r>
+        <w:t xml:space="preserve">    encoded_name=$(echo "$clean_sn" | sed 's/ /%20/g')</w:t>
+      </w:r>
+    </w:p>
+    <w:p/>
+    <w:p>
+      <w:r>
+        <w:t xml:space="preserve">    api_url="https://ecos.fws.gov/ecp/pullreports/catalog/species/report/species/export?format=json&amp;columns=/species@cn,sn,status,listing_date&amp;filter=/species@sn='$encoded_name'"</w:t>
+      </w:r>
+    </w:p>
+    <w:p>
+      <w:r>
+        <w:t xml:space="preserve">    </w:t>
+      </w:r>
+    </w:p>
+    <w:p>
+      <w:r>
+        <w:t xml:space="preserve">    response=$(curl -s -L -A "$USER_AGENT" "$api_url")</w:t>
+      </w:r>
+    </w:p>
+    <w:p/>
+    <w:p>
       <w:r>
         <w:t xml:space="preserve"> </w:t>
       </w:r>
-      <w:proofErr w:type="spellStart"/>
-      <w:r>
-        <w:t>Name,URL,Status,Date</w:t>
-      </w:r>
-      <w:proofErr w:type="spellEnd"/>
-      <w:r>
-        <w:t xml:space="preserve"> </w:t>
-      </w:r>
-      <w:proofErr w:type="spellStart"/>
-      <w:r>
-        <w:t>Listed,Lead</w:t>
-      </w:r>
-      <w:proofErr w:type="spellEnd"/>
-      <w:r>
-        <w:t xml:space="preserve"> </w:t>
-      </w:r>
-      <w:proofErr w:type="spellStart"/>
-      <w:r>
-        <w:t>Region,Where</w:t>
-      </w:r>
-      <w:proofErr w:type="spellEnd"/>
-      <w:r>
-        <w:t xml:space="preserve"> Listed" &gt; "$OUTPUT_FILE"</w:t>
+    </w:p>
+    <w:p>
+      <w:r>
+        <w:t xml:space="preserve">    clean_list=$(echo "$response" | sed 's/.*"data":\[\[//; s/\]\].*//' | sed 's/"," /|/g; s/","/|/g; s/,"/|/g; s/",/|/g')</w:t>
+      </w:r>
+    </w:p>
+    <w:p>
+      <w:r>
+        <w:t xml:space="preserve">    ext_status=$(echo "$clean_list" | cut -d'|' -f4 | tr -d '"{}' | sed 's/value://g' | xargs)</w:t>
+      </w:r>
+    </w:p>
+    <w:p>
+      <w:r>
+        <w:t xml:space="preserve">    ext_date=$(echo "$clean_list" | cut -d'|' -f5 | tr -d '"{}' | sed 's/value://g' | xargs)</w:t>
+      </w:r>
+    </w:p>
+    <w:p>
+      <w:r>
+        <w:t xml:space="preserve">    echo "$common_name,$scientific_name,$url,${ext_status:-N/A},${ext_date:-N/A},N/A,N/A" &gt;&gt; "$OUTPUT_FILE"</w:t>
       </w:r>
     </w:p>
     <w:p/>
     <w:p>
       <w:r>
-        <w:t xml:space="preserve">while IFS=',' read -r </w:t>
-      </w:r>
-      <w:proofErr w:type="spellStart"/>
-      <w:r>
-        <w:t>common_name</w:t>
-      </w:r>
-      <w:proofErr w:type="spellEnd"/>
-      <w:r>
-        <w:t xml:space="preserve"> </w:t>
-      </w:r>
-      <w:proofErr w:type="spellStart"/>
-      <w:r>
-        <w:t>scientific_name</w:t>
-      </w:r>
-      <w:proofErr w:type="spellEnd"/>
-      <w:r>
-        <w:t xml:space="preserve"> </w:t>
-      </w:r>
-      <w:proofErr w:type="spellStart"/>
-      <w:r>
-        <w:t>url</w:t>
-      </w:r>
-      <w:proofErr w:type="spellEnd"/>
-      <w:r>
-        <w:t xml:space="preserve"> </w:t>
-      </w:r>
-      <w:proofErr w:type="spellStart"/>
-      <w:r>
-        <w:t>old_status</w:t>
-      </w:r>
-      <w:proofErr w:type="spellEnd"/>
-      <w:r>
-        <w:t>; do</w:t>
-      </w:r>
-    </w:p>
-    <w:p>
-      <w:r>
-        <w:t xml:space="preserve">    # Skip the header row of the input file</w:t>
-      </w:r>
-    </w:p>
-    <w:p>
-      <w:r>
-        <w:t xml:space="preserve">    if [[ "$</w:t>
-      </w:r>
-      <w:proofErr w:type="spellStart"/>
-      <w:r>
-        <w:t>common_name</w:t>
-      </w:r>
-      <w:proofErr w:type="spellEnd"/>
-      <w:r>
-        <w:t>" == "Common Name" || -z "$</w:t>
-      </w:r>
-      <w:proofErr w:type="spellStart"/>
-      <w:r>
-        <w:t>scientific_</w:t>
-      </w:r>
-      <w:proofErr w:type="gramStart"/>
-      <w:r>
-        <w:t>name</w:t>
-      </w:r>
-      <w:proofErr w:type="spellEnd"/>
-      <w:r>
-        <w:t>" ]</w:t>
-      </w:r>
-      <w:proofErr w:type="gramEnd"/>
-      <w:r>
-        <w:t>]; then continue; fi</w:t>
+        <w:t xml:space="preserve">    echo "Successfully updated $scientific_name"</w:t>
+      </w:r>
+    </w:p>
+    <w:p>
+      <w:r>
+        <w:t xml:space="preserve">    sleep 1</w:t>
+      </w:r>
+    </w:p>
+    <w:p>
+      <w:r>
+        <w:t>done &lt; "$INPUT_FILE"</w:t>
+      </w:r>
+    </w:p>
+    <w:p>
+      <w:r>
+        <w:t>mv "$OUTPUT_FILE" "$INPUT_FILE"</w:t>
       </w:r>
     </w:p>
     <w:p/>
     <w:p>
-      <w:r>
-        <w:t xml:space="preserve">    echo "--------------------------------------------------"</w:t>
-      </w:r>
-    </w:p>
-    <w:p>
-      <w:r>
-        <w:t xml:space="preserve">    echo "Updating: $</w:t>
-      </w:r>
-      <w:proofErr w:type="spellStart"/>
-      <w:r>
-        <w:t>scientific_name</w:t>
-      </w:r>
-      <w:proofErr w:type="spellEnd"/>
-      <w:r>
-        <w:t>"</w:t>
+      <w:pPr>
+        <w:rPr>
+          <w:b/>
+          <w:bCs/>
+          <w:i/>
+          <w:iCs/>
+        </w:rPr>
+      </w:pPr>
+      <w:r>
+        <w:rPr>
+          <w:b/>
+          <w:bCs/>
+          <w:i/>
+          <w:iCs/>
+        </w:rPr>
+        <w:t>Data Analysis</w:t>
+      </w:r>
+    </w:p>
+    <w:p>
+      <w:pPr>
+        <w:rPr>
+          <w:b/>
+          <w:bCs/>
+          <w:i/>
+          <w:iCs/>
+        </w:rPr>
+      </w:pPr>
+      <w:r>
+        <w:rPr>
+          <w:b/>
+          <w:bCs/>
+          <w:i/>
+          <w:iCs/>
+          <w:noProof/>
+        </w:rPr>
+        <w:drawing>
+          <wp:inline distT="0" distB="0" distL="0" distR="0" wp14:anchorId="183F54C4" wp14:editId="14D121C3">
+            <wp:extent cx="5943600" cy="3853180"/>
+            <wp:effectExtent l="0" t="0" r="0" b="0"/>
+            <wp:docPr id="2032113729" name="Picture 1"/>
+            <wp:cNvGraphicFramePr>
+              <a:graphicFrameLocks xmlns:a="http://schemas.openxmlformats.org/drawingml/2006/main" noChangeAspect="1"/>
+            </wp:cNvGraphicFramePr>
+            <a:graphic xmlns:a="http://schemas.openxmlformats.org/drawingml/2006/main">
+              <a:graphicData uri="http://schemas.openxmlformats.org/drawingml/2006/picture">
+                <pic:pic xmlns:pic="http://schemas.openxmlformats.org/drawingml/2006/picture">
+                  <pic:nvPicPr>
+                    <pic:cNvPr id="2032113729" name="Picture 2032113729"/>
+                    <pic:cNvPicPr/>
+                  </pic:nvPicPr>
+                  <pic:blipFill>
+                    <a:blip r:embed="rId6">
+                      <a:extLst>
+                        <a:ext uri="{28A0092B-C50C-407E-A947-70E740481C1C}">
+                          <a14:useLocalDpi xmlns:a14="http://schemas.microsoft.com/office/drawing/2010/main" val="0"/>
+                        </a:ext>
+                      </a:extLst>
+                    </a:blip>
+                    <a:stretch>
+                      <a:fillRect/>
+                    </a:stretch>
+                  </pic:blipFill>
+                  <pic:spPr>
+                    <a:xfrm>
+                      <a:off x="0" y="0"/>
+                      <a:ext cx="5943600" cy="3853180"/>
+                    </a:xfrm>
+                    <a:prstGeom prst="rect">
+                      <a:avLst/>
+                    </a:prstGeom>
+                  </pic:spPr>
+                </pic:pic>
+              </a:graphicData>
+            </a:graphic>
+          </wp:inline>
+        </w:drawing>
       </w:r>
     </w:p>
     <w:p/>
     <w:p>
-      <w:r>
-        <w:t xml:space="preserve">    </w:t>
-      </w:r>
-      <w:proofErr w:type="spellStart"/>
-      <w:r>
-        <w:t>clean_sn</w:t>
-      </w:r>
-      <w:proofErr w:type="spellEnd"/>
-      <w:r>
-        <w:t>=$(echo "$</w:t>
-      </w:r>
-      <w:proofErr w:type="spellStart"/>
-      <w:r>
-        <w:t>scientific_name</w:t>
-      </w:r>
-      <w:proofErr w:type="spellEnd"/>
-      <w:r>
-        <w:t xml:space="preserve">" | </w:t>
-      </w:r>
-      <w:proofErr w:type="spellStart"/>
-      <w:r>
-        <w:t>xargs</w:t>
-      </w:r>
-      <w:proofErr w:type="spellEnd"/>
-      <w:r>
-        <w:t>)</w:t>
-      </w:r>
-    </w:p>
-    <w:p>
-      <w:r>
-        <w:t xml:space="preserve">    </w:t>
-      </w:r>
-      <w:proofErr w:type="spellStart"/>
-      <w:r>
-        <w:t>encoded_name</w:t>
-      </w:r>
-      <w:proofErr w:type="spellEnd"/>
-      <w:r>
-        <w:t>=$(echo "$</w:t>
-      </w:r>
-      <w:proofErr w:type="spellStart"/>
-      <w:r>
-        <w:t>clean_sn</w:t>
-      </w:r>
-      <w:proofErr w:type="spellEnd"/>
-      <w:r>
-        <w:t>" | sed 's/ /%20/g')</w:t>
-      </w:r>
-    </w:p>
-    <w:p/>
-    <w:p>
-      <w:r>
-        <w:t xml:space="preserve">    api_url="https://ecos.fws.gov/ecp/pullreports/catalog/species/report/species/export?format=json&amp;columns=/species@cn,sn,status,listing_date&amp;filter=/species@sn='$encoded_name'"</w:t>
-      </w:r>
-    </w:p>
-    <w:p>
-      <w:r>
-        <w:t xml:space="preserve">    </w:t>
-      </w:r>
-    </w:p>
-    <w:p>
-      <w:r>
-        <w:t xml:space="preserve">    response=$(</w:t>
-      </w:r>
-      <w:proofErr w:type="gramStart"/>
-      <w:r>
-        <w:t>curl -s -L</w:t>
-      </w:r>
-      <w:proofErr w:type="gramEnd"/>
-      <w:r>
-        <w:t xml:space="preserve"> -A "$USER_AGENT" "$</w:t>
-      </w:r>
-      <w:proofErr w:type="spellStart"/>
-      <w:r>
-        <w:t>api_url</w:t>
-      </w:r>
-      <w:proofErr w:type="spellEnd"/>
-      <w:r>
-        <w:t>")</w:t>
-      </w:r>
-    </w:p>
-    <w:p/>
-    <w:p>
-      <w:r>
-        <w:t xml:space="preserve"> </w:t>
-      </w:r>
-    </w:p>
-    <w:p>
-      <w:r>
-        <w:t xml:space="preserve">    </w:t>
-      </w:r>
-      <w:proofErr w:type="spellStart"/>
-      <w:r>
-        <w:t>clean_list</w:t>
-      </w:r>
-      <w:proofErr w:type="spellEnd"/>
-      <w:r>
-        <w:t>=$(echo "$response" | sed 's/.*"data":\[\[</w:t>
-      </w:r>
-      <w:proofErr w:type="gramStart"/>
-      <w:r>
-        <w:t>//; s/\]\].*//' |</w:t>
-      </w:r>
-      <w:proofErr w:type="gramEnd"/>
-      <w:r>
-        <w:t xml:space="preserve"> sed 's/"," /|/g; s/","/|/g; s/</w:t>
-      </w:r>
-      <w:proofErr w:type="gramStart"/>
-      <w:r>
-        <w:t>,"/|</w:t>
-      </w:r>
-      <w:proofErr w:type="gramEnd"/>
-      <w:r>
-        <w:t>/g; s/",/|/</w:t>
-      </w:r>
-      <w:proofErr w:type="gramStart"/>
-      <w:r>
-        <w:t>g')</w:t>
-      </w:r>
-      <w:proofErr w:type="gramEnd"/>
-    </w:p>
-    <w:p>
-      <w:r>
-        <w:t xml:space="preserve">    </w:t>
-      </w:r>
-      <w:proofErr w:type="spellStart"/>
-      <w:r>
-        <w:t>ext_status</w:t>
-      </w:r>
-      <w:proofErr w:type="spellEnd"/>
-      <w:r>
-        <w:t>=$(echo "$</w:t>
-      </w:r>
-      <w:proofErr w:type="spellStart"/>
-      <w:r>
-        <w:t>clean_list</w:t>
-      </w:r>
-      <w:proofErr w:type="spellEnd"/>
-      <w:r>
-        <w:t xml:space="preserve">" | cut -d'|' -f4 | tr -d </w:t>
-      </w:r>
-      <w:proofErr w:type="gramStart"/>
-      <w:r>
-        <w:t>'"{}</w:t>
-      </w:r>
-      <w:proofErr w:type="gramEnd"/>
-      <w:r>
-        <w:t xml:space="preserve">' | sed 's/value://g' | </w:t>
-      </w:r>
-      <w:proofErr w:type="spellStart"/>
-      <w:r>
-        <w:t>xargs</w:t>
-      </w:r>
-      <w:proofErr w:type="spellEnd"/>
-      <w:r>
-        <w:t>)</w:t>
-      </w:r>
-    </w:p>
-    <w:p>
-      <w:r>
-        <w:t xml:space="preserve">    </w:t>
-      </w:r>
-      <w:proofErr w:type="spellStart"/>
-      <w:r>
-        <w:t>ext_date</w:t>
-      </w:r>
-      <w:proofErr w:type="spellEnd"/>
-      <w:r>
-        <w:t>=$(echo "$</w:t>
-      </w:r>
-      <w:proofErr w:type="spellStart"/>
-      <w:r>
-        <w:t>clean_list</w:t>
-      </w:r>
-      <w:proofErr w:type="spellEnd"/>
-      <w:r>
-        <w:t xml:space="preserve">" | cut -d'|' -f5 | tr -d </w:t>
-      </w:r>
-      <w:proofErr w:type="gramStart"/>
-      <w:r>
-        <w:t>'"{}</w:t>
-      </w:r>
-      <w:proofErr w:type="gramEnd"/>
-      <w:r>
-        <w:t xml:space="preserve">' | sed 's/value://g' | </w:t>
-      </w:r>
-      <w:proofErr w:type="spellStart"/>
-      <w:r>
-        <w:t>xargs</w:t>
-      </w:r>
-      <w:proofErr w:type="spellEnd"/>
-      <w:r>
-        <w:t>)</w:t>
-      </w:r>
-    </w:p>
-    <w:p>
-      <w:r>
-        <w:t xml:space="preserve">    echo "$common_name,$scientific_name,$url,${ext_status:-N/</w:t>
-      </w:r>
-      <w:proofErr w:type="gramStart"/>
-      <w:r>
-        <w:t>A},</w:t>
-      </w:r>
-      <w:proofErr w:type="gramEnd"/>
-      <w:r>
-        <w:t>${ext_date:-N/</w:t>
-      </w:r>
-      <w:proofErr w:type="gramStart"/>
-      <w:r>
-        <w:t>A},</w:t>
-      </w:r>
-      <w:proofErr w:type="gramEnd"/>
-      <w:r>
-        <w:t>N</w:t>
-      </w:r>
-      <w:proofErr w:type="gramStart"/>
-      <w:r>
-        <w:t>/A,</w:t>
-      </w:r>
-      <w:proofErr w:type="gramEnd"/>
-      <w:r>
-        <w:t>N/A" &gt;&gt; "$OUTPUT_FILE"</w:t>
-      </w:r>
-    </w:p>
-    <w:p/>
-    <w:p>
-      <w:r>
-        <w:t xml:space="preserve">    echo "Successfully updated $</w:t>
-      </w:r>
-      <w:proofErr w:type="spellStart"/>
-      <w:r>
-        <w:t>scientific_name</w:t>
-      </w:r>
-      <w:proofErr w:type="spellEnd"/>
-      <w:r>
-        <w:t>"</w:t>
-      </w:r>
-    </w:p>
-    <w:p>
-      <w:r>
-        <w:t xml:space="preserve">    sleep 1</w:t>
-      </w:r>
-    </w:p>
-    <w:p>
-      <w:r>
-        <w:t>done &lt; "$INPUT_FILE"</w:t>
-      </w:r>
-    </w:p>
-    <w:p>
-      <w:r>
-        <w:t>mv "$OUTPUT_FILE" "$INPUT_FILE"</w:t>
+      <w:pPr>
+        <w:rPr>
+          <w:b/>
+          <w:bCs/>
+          <w:i/>
+          <w:iCs/>
+        </w:rPr>
+      </w:pPr>
+      <w:r>
+        <w:rPr>
+          <w:b/>
+          <w:bCs/>
+          <w:i/>
+          <w:iCs/>
+        </w:rPr>
+        <w:t>New Results</w:t>
+      </w:r>
+    </w:p>
+    <w:p>
+      <w:r>
+        <w:t>After further analysis, my initial analysis was incorrect. Throughout the years, the number of listings being put up has actually decreased. The number has decreased to about 14% of what it initially was, from 140 to now only 20 being put in a year. After further research, with more environmental laws put in place to protect areas, the urbanization of certain types of environments is not possible.</w:t>
       </w:r>
     </w:p>
     <w:sectPr>

</xml_diff>